<commit_message>
Shto backend-in Spring Boot
</commit_message>
<xml_diff>
--- a/Sistemi për menaxhimin e dokumenteve dhe arkivës digjitale.docx
+++ b/Sistemi për menaxhimin e dokumenteve dhe arkivës digjitale.docx
@@ -535,6 +535,7 @@
               <w:tab w:val="right" w:leader="dot" w:pos="9350"/>
             </w:tabs>
             <w:rPr>
+              <w:rFonts w:eastAsiaTheme="minorEastAsia"/>
               <w:noProof/>
             </w:rPr>
           </w:pPr>
@@ -547,7 +548,7 @@
           <w:r>
             <w:fldChar w:fldCharType="separate"/>
           </w:r>
-          <w:hyperlink w:anchor="_Toc243235568" w:history="1">
+          <w:hyperlink w:anchor="_Toc243473623" w:history="1">
             <w:r>
               <w:rPr>
                 <w:rStyle w:val="Hyperlink"/>
@@ -555,9 +556,8 @@
                 <w:b/>
                 <w:bCs/>
                 <w:noProof/>
-                <w:lang w:val="pl-PL"/>
-              </w:rPr>
-              <w:t>Raporti 1</w:t>
+              </w:rPr>
+              <w:t>RAPORTI 1</w:t>
             </w:r>
             <w:r>
               <w:rPr>
@@ -578,7 +578,7 @@
                 <w:noProof/>
                 <w:webHidden/>
               </w:rPr>
-              <w:instrText xml:space="preserve"> PAGEREF _Toc243235568 \h </w:instrText>
+              <w:instrText xml:space="preserve"> PAGEREF _Toc243473623 \h </w:instrText>
             </w:r>
             <w:r>
               <w:rPr>
@@ -598,7 +598,7 @@
                 <w:noProof/>
                 <w:webHidden/>
               </w:rPr>
-              <w:t>2</w:t>
+              <w:t>4</w:t>
             </w:r>
             <w:r>
               <w:rPr>
@@ -616,10 +616,11 @@
               <w:tab w:val="right" w:leader="dot" w:pos="9350"/>
             </w:tabs>
             <w:rPr>
+              <w:rFonts w:eastAsiaTheme="minorEastAsia"/>
               <w:noProof/>
             </w:rPr>
           </w:pPr>
-          <w:hyperlink w:anchor="_Toc243235569" w:history="1">
+          <w:hyperlink w:anchor="_Toc243473624" w:history="1">
             <w:r>
               <w:rPr>
                 <w:rStyle w:val="Hyperlink"/>
@@ -627,7 +628,6 @@
                 <w:b/>
                 <w:bCs/>
                 <w:noProof/>
-                <w:lang w:val="pl-PL"/>
               </w:rPr>
               <w:t>1. HYRJE</w:t>
             </w:r>
@@ -650,7 +650,7 @@
                 <w:noProof/>
                 <w:webHidden/>
               </w:rPr>
-              <w:instrText xml:space="preserve"> PAGEREF _Toc243235569 \h </w:instrText>
+              <w:instrText xml:space="preserve"> PAGEREF _Toc243473624 \h </w:instrText>
             </w:r>
             <w:r>
               <w:rPr>
@@ -670,7 +670,7 @@
                 <w:noProof/>
                 <w:webHidden/>
               </w:rPr>
-              <w:t>2</w:t>
+              <w:t>4</w:t>
             </w:r>
             <w:r>
               <w:rPr>
@@ -688,10 +688,11 @@
               <w:tab w:val="right" w:leader="dot" w:pos="9350"/>
             </w:tabs>
             <w:rPr>
+              <w:rFonts w:eastAsiaTheme="minorEastAsia"/>
               <w:noProof/>
             </w:rPr>
           </w:pPr>
-          <w:hyperlink w:anchor="_Toc243235570" w:history="1">
+          <w:hyperlink w:anchor="_Toc243473625" w:history="1">
             <w:r>
               <w:rPr>
                 <w:rStyle w:val="Hyperlink"/>
@@ -699,7 +700,6 @@
                 <w:b/>
                 <w:bCs/>
                 <w:noProof/>
-                <w:lang w:val="pl-PL"/>
               </w:rPr>
               <w:t>2. PËRSHKRIMI I PROBLEMIT</w:t>
             </w:r>
@@ -722,7 +722,7 @@
                 <w:noProof/>
                 <w:webHidden/>
               </w:rPr>
-              <w:instrText xml:space="preserve"> PAGEREF _Toc243235570 \h </w:instrText>
+              <w:instrText xml:space="preserve"> PAGEREF _Toc243473625 \h </w:instrText>
             </w:r>
             <w:r>
               <w:rPr>
@@ -742,7 +742,7 @@
                 <w:noProof/>
                 <w:webHidden/>
               </w:rPr>
-              <w:t>2</w:t>
+              <w:t>4</w:t>
             </w:r>
             <w:r>
               <w:rPr>
@@ -760,10 +760,11 @@
               <w:tab w:val="right" w:leader="dot" w:pos="9350"/>
             </w:tabs>
             <w:rPr>
+              <w:rFonts w:eastAsiaTheme="minorEastAsia"/>
               <w:noProof/>
             </w:rPr>
           </w:pPr>
-          <w:hyperlink w:anchor="_Toc243235571" w:history="1">
+          <w:hyperlink w:anchor="_Toc243473626" w:history="1">
             <w:r>
               <w:rPr>
                 <w:rStyle w:val="Hyperlink"/>
@@ -793,7 +794,7 @@
                 <w:noProof/>
                 <w:webHidden/>
               </w:rPr>
-              <w:instrText xml:space="preserve"> PAGEREF _Toc243235571 \h </w:instrText>
+              <w:instrText xml:space="preserve"> PAGEREF _Toc243473626 \h </w:instrText>
             </w:r>
             <w:r>
               <w:rPr>
@@ -813,7 +814,7 @@
                 <w:noProof/>
                 <w:webHidden/>
               </w:rPr>
-              <w:t>2</w:t>
+              <w:t>4</w:t>
             </w:r>
             <w:r>
               <w:rPr>
@@ -831,10 +832,11 @@
               <w:tab w:val="right" w:leader="dot" w:pos="9350"/>
             </w:tabs>
             <w:rPr>
+              <w:rFonts w:eastAsiaTheme="minorEastAsia"/>
               <w:noProof/>
             </w:rPr>
           </w:pPr>
-          <w:hyperlink w:anchor="_Toc243235572" w:history="1">
+          <w:hyperlink w:anchor="_Toc243473627" w:history="1">
             <w:r>
               <w:rPr>
                 <w:rStyle w:val="Hyperlink"/>
@@ -865,7 +867,7 @@
                 <w:noProof/>
                 <w:webHidden/>
               </w:rPr>
-              <w:instrText xml:space="preserve"> PAGEREF _Toc243235572 \h </w:instrText>
+              <w:instrText xml:space="preserve"> PAGEREF _Toc243473627 \h </w:instrText>
             </w:r>
             <w:r>
               <w:rPr>
@@ -885,7 +887,7 @@
                 <w:noProof/>
                 <w:webHidden/>
               </w:rPr>
-              <w:t>3</w:t>
+              <w:t>5</w:t>
             </w:r>
             <w:r>
               <w:rPr>
@@ -903,10 +905,11 @@
               <w:tab w:val="right" w:leader="dot" w:pos="9350"/>
             </w:tabs>
             <w:rPr>
+              <w:rFonts w:eastAsiaTheme="minorEastAsia"/>
               <w:noProof/>
             </w:rPr>
           </w:pPr>
-          <w:hyperlink w:anchor="_Toc243235573" w:history="1">
+          <w:hyperlink w:anchor="_Toc243473628" w:history="1">
             <w:r>
               <w:rPr>
                 <w:rStyle w:val="Hyperlink"/>
@@ -937,7 +940,7 @@
                 <w:noProof/>
                 <w:webHidden/>
               </w:rPr>
-              <w:instrText xml:space="preserve"> PAGEREF _Toc243235573 \h </w:instrText>
+              <w:instrText xml:space="preserve"> PAGEREF _Toc243473628 \h </w:instrText>
             </w:r>
             <w:r>
               <w:rPr>
@@ -957,7 +960,7 @@
                 <w:noProof/>
                 <w:webHidden/>
               </w:rPr>
-              <w:t>3</w:t>
+              <w:t>5</w:t>
             </w:r>
             <w:r>
               <w:rPr>
@@ -975,10 +978,11 @@
               <w:tab w:val="right" w:leader="dot" w:pos="9350"/>
             </w:tabs>
             <w:rPr>
+              <w:rFonts w:eastAsiaTheme="minorEastAsia"/>
               <w:noProof/>
             </w:rPr>
           </w:pPr>
-          <w:hyperlink w:anchor="_Toc243235574" w:history="1">
+          <w:hyperlink w:anchor="_Toc243473629" w:history="1">
             <w:r>
               <w:rPr>
                 <w:rStyle w:val="Hyperlink"/>
@@ -1008,7 +1012,7 @@
                 <w:noProof/>
                 <w:webHidden/>
               </w:rPr>
-              <w:instrText xml:space="preserve"> PAGEREF _Toc243235574 \h </w:instrText>
+              <w:instrText xml:space="preserve"> PAGEREF _Toc243473629 \h </w:instrText>
             </w:r>
             <w:r>
               <w:rPr>
@@ -1028,7 +1032,7 @@
                 <w:noProof/>
                 <w:webHidden/>
               </w:rPr>
-              <w:t>3</w:t>
+              <w:t>5</w:t>
             </w:r>
             <w:r>
               <w:rPr>
@@ -1046,10 +1050,11 @@
               <w:tab w:val="right" w:leader="dot" w:pos="9350"/>
             </w:tabs>
             <w:rPr>
+              <w:rFonts w:eastAsiaTheme="minorEastAsia"/>
               <w:noProof/>
             </w:rPr>
           </w:pPr>
-          <w:hyperlink w:anchor="_Toc243235575" w:history="1">
+          <w:hyperlink w:anchor="_Toc243473630" w:history="1">
             <w:r>
               <w:rPr>
                 <w:rStyle w:val="Hyperlink"/>
@@ -1080,7 +1085,7 @@
                 <w:noProof/>
                 <w:webHidden/>
               </w:rPr>
-              <w:instrText xml:space="preserve"> PAGEREF _Toc243235575 \h </w:instrText>
+              <w:instrText xml:space="preserve"> PAGEREF _Toc243473630 \h </w:instrText>
             </w:r>
             <w:r>
               <w:rPr>
@@ -1100,7 +1105,7 @@
                 <w:noProof/>
                 <w:webHidden/>
               </w:rPr>
-              <w:t>3</w:t>
+              <w:t>6</w:t>
             </w:r>
             <w:r>
               <w:rPr>
@@ -1118,10 +1123,11 @@
               <w:tab w:val="right" w:leader="dot" w:pos="9350"/>
             </w:tabs>
             <w:rPr>
+              <w:rFonts w:eastAsiaTheme="minorEastAsia"/>
               <w:noProof/>
             </w:rPr>
           </w:pPr>
-          <w:hyperlink w:anchor="_Toc243235576" w:history="1">
+          <w:hyperlink w:anchor="_Toc243473631" w:history="1">
             <w:r>
               <w:rPr>
                 <w:rStyle w:val="Hyperlink"/>
@@ -1152,7 +1158,7 @@
                 <w:noProof/>
                 <w:webHidden/>
               </w:rPr>
-              <w:instrText xml:space="preserve"> PAGEREF _Toc243235576 \h </w:instrText>
+              <w:instrText xml:space="preserve"> PAGEREF _Toc243473631 \h </w:instrText>
             </w:r>
             <w:r>
               <w:rPr>
@@ -1172,7 +1178,7 @@
                 <w:noProof/>
                 <w:webHidden/>
               </w:rPr>
-              <w:t>4</w:t>
+              <w:t>6</w:t>
             </w:r>
             <w:r>
               <w:rPr>
@@ -1190,10 +1196,11 @@
               <w:tab w:val="right" w:leader="dot" w:pos="9350"/>
             </w:tabs>
             <w:rPr>
+              <w:rFonts w:eastAsiaTheme="minorEastAsia"/>
               <w:noProof/>
             </w:rPr>
           </w:pPr>
-          <w:hyperlink w:anchor="_Toc243235577" w:history="1">
+          <w:hyperlink w:anchor="_Toc243473632" w:history="1">
             <w:r>
               <w:rPr>
                 <w:rStyle w:val="Hyperlink"/>
@@ -1224,7 +1231,7 @@
                 <w:noProof/>
                 <w:webHidden/>
               </w:rPr>
-              <w:instrText xml:space="preserve"> PAGEREF _Toc243235577 \h </w:instrText>
+              <w:instrText xml:space="preserve"> PAGEREF _Toc243473632 \h </w:instrText>
             </w:r>
             <w:r>
               <w:rPr>
@@ -1244,7 +1251,7 @@
                 <w:noProof/>
                 <w:webHidden/>
               </w:rPr>
-              <w:t>4</w:t>
+              <w:t>6</w:t>
             </w:r>
             <w:r>
               <w:rPr>
@@ -1262,10 +1269,11 @@
               <w:tab w:val="right" w:leader="dot" w:pos="9350"/>
             </w:tabs>
             <w:rPr>
+              <w:rFonts w:eastAsiaTheme="minorEastAsia"/>
               <w:noProof/>
             </w:rPr>
           </w:pPr>
-          <w:hyperlink w:anchor="_Toc243235578" w:history="1">
+          <w:hyperlink w:anchor="_Toc243473633" w:history="1">
             <w:r>
               <w:rPr>
                 <w:rStyle w:val="Hyperlink"/>
@@ -1296,7 +1304,7 @@
                 <w:noProof/>
                 <w:webHidden/>
               </w:rPr>
-              <w:instrText xml:space="preserve"> PAGEREF _Toc243235578 \h </w:instrText>
+              <w:instrText xml:space="preserve"> PAGEREF _Toc243473633 \h </w:instrText>
             </w:r>
             <w:r>
               <w:rPr>
@@ -1316,7 +1324,7 @@
                 <w:noProof/>
                 <w:webHidden/>
               </w:rPr>
-              <w:t>4</w:t>
+              <w:t>6</w:t>
             </w:r>
             <w:r>
               <w:rPr>
@@ -1334,10 +1342,11 @@
               <w:tab w:val="right" w:leader="dot" w:pos="9350"/>
             </w:tabs>
             <w:rPr>
+              <w:rFonts w:eastAsiaTheme="minorEastAsia"/>
               <w:noProof/>
             </w:rPr>
           </w:pPr>
-          <w:hyperlink w:anchor="_Toc243235579" w:history="1">
+          <w:hyperlink w:anchor="_Toc243473634" w:history="1">
             <w:r>
               <w:rPr>
                 <w:rStyle w:val="Hyperlink"/>
@@ -1368,7 +1377,7 @@
                 <w:noProof/>
                 <w:webHidden/>
               </w:rPr>
-              <w:instrText xml:space="preserve"> PAGEREF _Toc243235579 \h </w:instrText>
+              <w:instrText xml:space="preserve"> PAGEREF _Toc243473634 \h </w:instrText>
             </w:r>
             <w:r>
               <w:rPr>
@@ -1388,7 +1397,7 @@
                 <w:noProof/>
                 <w:webHidden/>
               </w:rPr>
-              <w:t>4</w:t>
+              <w:t>6</w:t>
             </w:r>
             <w:r>
               <w:rPr>
@@ -1406,10 +1415,11 @@
               <w:tab w:val="right" w:leader="dot" w:pos="9350"/>
             </w:tabs>
             <w:rPr>
+              <w:rFonts w:eastAsiaTheme="minorEastAsia"/>
               <w:noProof/>
             </w:rPr>
           </w:pPr>
-          <w:hyperlink w:anchor="_Toc243235580" w:history="1">
+          <w:hyperlink w:anchor="_Toc243473635" w:history="1">
             <w:r>
               <w:rPr>
                 <w:rStyle w:val="Hyperlink"/>
@@ -1440,7 +1450,7 @@
                 <w:noProof/>
                 <w:webHidden/>
               </w:rPr>
-              <w:instrText xml:space="preserve"> PAGEREF _Toc243235580 \h </w:instrText>
+              <w:instrText xml:space="preserve"> PAGEREF _Toc243473635 \h </w:instrText>
             </w:r>
             <w:r>
               <w:rPr>
@@ -1460,7 +1470,7 @@
                 <w:noProof/>
                 <w:webHidden/>
               </w:rPr>
-              <w:t>4</w:t>
+              <w:t>6</w:t>
             </w:r>
             <w:r>
               <w:rPr>
@@ -1478,10 +1488,11 @@
               <w:tab w:val="right" w:leader="dot" w:pos="9350"/>
             </w:tabs>
             <w:rPr>
+              <w:rFonts w:eastAsiaTheme="minorEastAsia"/>
               <w:noProof/>
             </w:rPr>
           </w:pPr>
-          <w:hyperlink w:anchor="_Toc243235581" w:history="1">
+          <w:hyperlink w:anchor="_Toc243473636" w:history="1">
             <w:r>
               <w:rPr>
                 <w:rStyle w:val="Hyperlink"/>
@@ -1512,7 +1523,7 @@
                 <w:noProof/>
                 <w:webHidden/>
               </w:rPr>
-              <w:instrText xml:space="preserve"> PAGEREF _Toc243235581 \h </w:instrText>
+              <w:instrText xml:space="preserve"> PAGEREF _Toc243473636 \h </w:instrText>
             </w:r>
             <w:r>
               <w:rPr>
@@ -1532,7 +1543,7 @@
                 <w:noProof/>
                 <w:webHidden/>
               </w:rPr>
-              <w:t>4</w:t>
+              <w:t>6</w:t>
             </w:r>
             <w:r>
               <w:rPr>
@@ -1550,10 +1561,11 @@
               <w:tab w:val="right" w:leader="dot" w:pos="9350"/>
             </w:tabs>
             <w:rPr>
+              <w:rFonts w:eastAsiaTheme="minorEastAsia"/>
               <w:noProof/>
             </w:rPr>
           </w:pPr>
-          <w:hyperlink w:anchor="_Toc243235582" w:history="1">
+          <w:hyperlink w:anchor="_Toc243473637" w:history="1">
             <w:r>
               <w:rPr>
                 <w:rStyle w:val="Hyperlink"/>
@@ -1584,7 +1596,7 @@
                 <w:noProof/>
                 <w:webHidden/>
               </w:rPr>
-              <w:instrText xml:space="preserve"> PAGEREF _Toc243235582 \h </w:instrText>
+              <w:instrText xml:space="preserve"> PAGEREF _Toc243473637 \h </w:instrText>
             </w:r>
             <w:r>
               <w:rPr>
@@ -1604,7 +1616,7 @@
                 <w:noProof/>
                 <w:webHidden/>
               </w:rPr>
-              <w:t>4</w:t>
+              <w:t>6</w:t>
             </w:r>
             <w:r>
               <w:rPr>
@@ -1622,10 +1634,11 @@
               <w:tab w:val="right" w:leader="dot" w:pos="9350"/>
             </w:tabs>
             <w:rPr>
+              <w:rFonts w:eastAsiaTheme="minorEastAsia"/>
               <w:noProof/>
             </w:rPr>
           </w:pPr>
-          <w:hyperlink w:anchor="_Toc243235583" w:history="1">
+          <w:hyperlink w:anchor="_Toc243473638" w:history="1">
             <w:r>
               <w:rPr>
                 <w:rStyle w:val="Hyperlink"/>
@@ -1656,7 +1669,7 @@
                 <w:noProof/>
                 <w:webHidden/>
               </w:rPr>
-              <w:instrText xml:space="preserve"> PAGEREF _Toc243235583 \h </w:instrText>
+              <w:instrText xml:space="preserve"> PAGEREF _Toc243473638 \h </w:instrText>
             </w:r>
             <w:r>
               <w:rPr>
@@ -1676,7 +1689,7 @@
                 <w:noProof/>
                 <w:webHidden/>
               </w:rPr>
-              <w:t>4</w:t>
+              <w:t>6</w:t>
             </w:r>
             <w:r>
               <w:rPr>
@@ -1694,10 +1707,11 @@
               <w:tab w:val="right" w:leader="dot" w:pos="9350"/>
             </w:tabs>
             <w:rPr>
+              <w:rFonts w:eastAsiaTheme="minorEastAsia"/>
               <w:noProof/>
             </w:rPr>
           </w:pPr>
-          <w:hyperlink w:anchor="_Toc243235584" w:history="1">
+          <w:hyperlink w:anchor="_Toc243473639" w:history="1">
             <w:r>
               <w:rPr>
                 <w:rStyle w:val="Hyperlink"/>
@@ -1727,7 +1741,7 @@
                 <w:noProof/>
                 <w:webHidden/>
               </w:rPr>
-              <w:instrText xml:space="preserve"> PAGEREF _Toc243235584 \h </w:instrText>
+              <w:instrText xml:space="preserve"> PAGEREF _Toc243473639 \h </w:instrText>
             </w:r>
             <w:r>
               <w:rPr>
@@ -1747,7 +1761,7 @@
                 <w:noProof/>
                 <w:webHidden/>
               </w:rPr>
-              <w:t>5</w:t>
+              <w:t>7</w:t>
             </w:r>
             <w:r>
               <w:rPr>
@@ -1765,10 +1779,11 @@
               <w:tab w:val="right" w:leader="dot" w:pos="9350"/>
             </w:tabs>
             <w:rPr>
+              <w:rFonts w:eastAsiaTheme="minorEastAsia"/>
               <w:noProof/>
             </w:rPr>
           </w:pPr>
-          <w:hyperlink w:anchor="_Toc243235585" w:history="1">
+          <w:hyperlink w:anchor="_Toc243473640" w:history="1">
             <w:r>
               <w:rPr>
                 <w:rStyle w:val="Hyperlink"/>
@@ -1798,7 +1813,7 @@
                 <w:noProof/>
                 <w:webHidden/>
               </w:rPr>
-              <w:instrText xml:space="preserve"> PAGEREF _Toc243235585 \h </w:instrText>
+              <w:instrText xml:space="preserve"> PAGEREF _Toc243473640 \h </w:instrText>
             </w:r>
             <w:r>
               <w:rPr>
@@ -1818,7 +1833,7 @@
                 <w:noProof/>
                 <w:webHidden/>
               </w:rPr>
-              <w:t>5</w:t>
+              <w:t>8</w:t>
             </w:r>
             <w:r>
               <w:rPr>
@@ -1836,10 +1851,11 @@
               <w:tab w:val="right" w:leader="dot" w:pos="9350"/>
             </w:tabs>
             <w:rPr>
+              <w:rFonts w:eastAsiaTheme="minorEastAsia"/>
               <w:noProof/>
             </w:rPr>
           </w:pPr>
-          <w:hyperlink w:anchor="_Toc243235586" w:history="1">
+          <w:hyperlink w:anchor="_Toc243473641" w:history="1">
             <w:r>
               <w:rPr>
                 <w:rStyle w:val="Hyperlink"/>
@@ -1869,7 +1885,7 @@
                 <w:noProof/>
                 <w:webHidden/>
               </w:rPr>
-              <w:instrText xml:space="preserve"> PAGEREF _Toc243235586 \h </w:instrText>
+              <w:instrText xml:space="preserve"> PAGEREF _Toc243473641 \h </w:instrText>
             </w:r>
             <w:r>
               <w:rPr>
@@ -1889,7 +1905,7 @@
                 <w:noProof/>
                 <w:webHidden/>
               </w:rPr>
-              <w:t>5</w:t>
+              <w:t>8</w:t>
             </w:r>
             <w:r>
               <w:rPr>
@@ -1907,10 +1923,11 @@
               <w:tab w:val="right" w:leader="dot" w:pos="9350"/>
             </w:tabs>
             <w:rPr>
+              <w:rFonts w:eastAsiaTheme="minorEastAsia"/>
               <w:noProof/>
             </w:rPr>
           </w:pPr>
-          <w:hyperlink w:anchor="_Toc243235587" w:history="1">
+          <w:hyperlink w:anchor="_Toc243473642" w:history="1">
             <w:r>
               <w:rPr>
                 <w:rStyle w:val="Hyperlink"/>
@@ -1940,7 +1957,7 @@
                 <w:noProof/>
                 <w:webHidden/>
               </w:rPr>
-              <w:instrText xml:space="preserve"> PAGEREF _Toc243235587 \h </w:instrText>
+              <w:instrText xml:space="preserve"> PAGEREF _Toc243473642 \h </w:instrText>
             </w:r>
             <w:r>
               <w:rPr>
@@ -1960,7 +1977,7 @@
                 <w:noProof/>
                 <w:webHidden/>
               </w:rPr>
-              <w:t>6</w:t>
+              <w:t>8</w:t>
             </w:r>
             <w:r>
               <w:rPr>
@@ -1978,10 +1995,11 @@
               <w:tab w:val="right" w:leader="dot" w:pos="9350"/>
             </w:tabs>
             <w:rPr>
+              <w:rFonts w:eastAsiaTheme="minorEastAsia"/>
               <w:noProof/>
             </w:rPr>
           </w:pPr>
-          <w:hyperlink w:anchor="_Toc243235588" w:history="1">
+          <w:hyperlink w:anchor="_Toc243473643" w:history="1">
             <w:r>
               <w:rPr>
                 <w:rStyle w:val="Hyperlink"/>
@@ -2011,7 +2029,7 @@
                 <w:noProof/>
                 <w:webHidden/>
               </w:rPr>
-              <w:instrText xml:space="preserve"> PAGEREF _Toc243235588 \h </w:instrText>
+              <w:instrText xml:space="preserve"> PAGEREF _Toc243473643 \h </w:instrText>
             </w:r>
             <w:r>
               <w:rPr>
@@ -2031,7 +2049,7 @@
                 <w:noProof/>
                 <w:webHidden/>
               </w:rPr>
-              <w:t>6</w:t>
+              <w:t>8</w:t>
             </w:r>
             <w:r>
               <w:rPr>
@@ -2049,10 +2067,11 @@
               <w:tab w:val="right" w:leader="dot" w:pos="9350"/>
             </w:tabs>
             <w:rPr>
+              <w:rFonts w:eastAsiaTheme="minorEastAsia"/>
               <w:noProof/>
             </w:rPr>
           </w:pPr>
-          <w:hyperlink w:anchor="_Toc243235589" w:history="1">
+          <w:hyperlink w:anchor="_Toc243473644" w:history="1">
             <w:r>
               <w:rPr>
                 <w:rStyle w:val="Hyperlink"/>
@@ -2082,7 +2101,7 @@
                 <w:noProof/>
                 <w:webHidden/>
               </w:rPr>
-              <w:instrText xml:space="preserve"> PAGEREF _Toc243235589 \h </w:instrText>
+              <w:instrText xml:space="preserve"> PAGEREF _Toc243473644 \h </w:instrText>
             </w:r>
             <w:r>
               <w:rPr>
@@ -2102,7 +2121,7 @@
                 <w:noProof/>
                 <w:webHidden/>
               </w:rPr>
-              <w:t>6</w:t>
+              <w:t>8</w:t>
             </w:r>
             <w:r>
               <w:rPr>
@@ -2120,10 +2139,11 @@
               <w:tab w:val="right" w:leader="dot" w:pos="9350"/>
             </w:tabs>
             <w:rPr>
+              <w:rFonts w:eastAsiaTheme="minorEastAsia"/>
               <w:noProof/>
             </w:rPr>
           </w:pPr>
-          <w:hyperlink w:anchor="_Toc243235590" w:history="1">
+          <w:hyperlink w:anchor="_Toc243473645" w:history="1">
             <w:r>
               <w:rPr>
                 <w:rStyle w:val="Hyperlink"/>
@@ -2153,7 +2173,7 @@
                 <w:noProof/>
                 <w:webHidden/>
               </w:rPr>
-              <w:instrText xml:space="preserve"> PAGEREF _Toc243235590 \h </w:instrText>
+              <w:instrText xml:space="preserve"> PAGEREF _Toc243473645 \h </w:instrText>
             </w:r>
             <w:r>
               <w:rPr>
@@ -2173,7 +2193,7 @@
                 <w:noProof/>
                 <w:webHidden/>
               </w:rPr>
-              <w:t>6</w:t>
+              <w:t>8</w:t>
             </w:r>
             <w:r>
               <w:rPr>
@@ -2191,10 +2211,11 @@
               <w:tab w:val="right" w:leader="dot" w:pos="9350"/>
             </w:tabs>
             <w:rPr>
+              <w:rFonts w:eastAsiaTheme="minorEastAsia"/>
               <w:noProof/>
             </w:rPr>
           </w:pPr>
-          <w:hyperlink w:anchor="_Toc243235591" w:history="1">
+          <w:hyperlink w:anchor="_Toc243473646" w:history="1">
             <w:r>
               <w:rPr>
                 <w:rStyle w:val="Hyperlink"/>
@@ -2225,7 +2246,7 @@
                 <w:noProof/>
                 <w:webHidden/>
               </w:rPr>
-              <w:instrText xml:space="preserve"> PAGEREF _Toc243235591 \h </w:instrText>
+              <w:instrText xml:space="preserve"> PAGEREF _Toc243473646 \h </w:instrText>
             </w:r>
             <w:r>
               <w:rPr>
@@ -2245,7 +2266,7 @@
                 <w:noProof/>
                 <w:webHidden/>
               </w:rPr>
-              <w:t>6</w:t>
+              <w:t>8</w:t>
             </w:r>
             <w:r>
               <w:rPr>
@@ -2263,10 +2284,11 @@
               <w:tab w:val="right" w:leader="dot" w:pos="9350"/>
             </w:tabs>
             <w:rPr>
+              <w:rFonts w:eastAsiaTheme="minorEastAsia"/>
               <w:noProof/>
             </w:rPr>
           </w:pPr>
-          <w:hyperlink w:anchor="_Toc243235592" w:history="1">
+          <w:hyperlink w:anchor="_Toc243473647" w:history="1">
             <w:r>
               <w:rPr>
                 <w:rStyle w:val="Hyperlink"/>
@@ -2296,7 +2318,7 @@
                 <w:noProof/>
                 <w:webHidden/>
               </w:rPr>
-              <w:instrText xml:space="preserve"> PAGEREF _Toc243235592 \h </w:instrText>
+              <w:instrText xml:space="preserve"> PAGEREF _Toc243473647 \h </w:instrText>
             </w:r>
             <w:r>
               <w:rPr>
@@ -2316,7 +2338,7 @@
                 <w:noProof/>
                 <w:webHidden/>
               </w:rPr>
-              <w:t>6</w:t>
+              <w:t>8</w:t>
             </w:r>
             <w:r>
               <w:rPr>
@@ -2334,10 +2356,11 @@
               <w:tab w:val="right" w:leader="dot" w:pos="9350"/>
             </w:tabs>
             <w:rPr>
+              <w:rFonts w:eastAsiaTheme="minorEastAsia"/>
               <w:noProof/>
             </w:rPr>
           </w:pPr>
-          <w:hyperlink w:anchor="_Toc243235593" w:history="1">
+          <w:hyperlink w:anchor="_Toc243473648" w:history="1">
             <w:r>
               <w:rPr>
                 <w:rStyle w:val="Hyperlink"/>
@@ -2367,7 +2390,7 @@
                 <w:noProof/>
                 <w:webHidden/>
               </w:rPr>
-              <w:instrText xml:space="preserve"> PAGEREF _Toc243235593 \h </w:instrText>
+              <w:instrText xml:space="preserve"> PAGEREF _Toc243473648 \h </w:instrText>
             </w:r>
             <w:r>
               <w:rPr>
@@ -2387,7 +2410,7 @@
                 <w:noProof/>
                 <w:webHidden/>
               </w:rPr>
-              <w:t>6</w:t>
+              <w:t>8</w:t>
             </w:r>
             <w:r>
               <w:rPr>
@@ -2405,10 +2428,11 @@
               <w:tab w:val="right" w:leader="dot" w:pos="9350"/>
             </w:tabs>
             <w:rPr>
+              <w:rFonts w:eastAsiaTheme="minorEastAsia"/>
               <w:noProof/>
             </w:rPr>
           </w:pPr>
-          <w:hyperlink w:anchor="_Toc243235594" w:history="1">
+          <w:hyperlink w:anchor="_Toc243473649" w:history="1">
             <w:r>
               <w:rPr>
                 <w:rStyle w:val="Hyperlink"/>
@@ -2439,7 +2463,7 @@
                 <w:noProof/>
                 <w:webHidden/>
               </w:rPr>
-              <w:instrText xml:space="preserve"> PAGEREF _Toc243235594 \h </w:instrText>
+              <w:instrText xml:space="preserve"> PAGEREF _Toc243473649 \h </w:instrText>
             </w:r>
             <w:r>
               <w:rPr>
@@ -2459,7 +2483,7 @@
                 <w:noProof/>
                 <w:webHidden/>
               </w:rPr>
-              <w:t>6</w:t>
+              <w:t>9</w:t>
             </w:r>
             <w:r>
               <w:rPr>
@@ -2477,10 +2501,11 @@
               <w:tab w:val="right" w:leader="dot" w:pos="9350"/>
             </w:tabs>
             <w:rPr>
+              <w:rFonts w:eastAsiaTheme="minorEastAsia"/>
               <w:noProof/>
             </w:rPr>
           </w:pPr>
-          <w:hyperlink w:anchor="_Toc243235595" w:history="1">
+          <w:hyperlink w:anchor="_Toc243473650" w:history="1">
             <w:r>
               <w:rPr>
                 <w:rStyle w:val="Hyperlink"/>
@@ -2510,7 +2535,7 @@
                 <w:noProof/>
                 <w:webHidden/>
               </w:rPr>
-              <w:instrText xml:space="preserve"> PAGEREF _Toc243235595 \h </w:instrText>
+              <w:instrText xml:space="preserve"> PAGEREF _Toc243473650 \h </w:instrText>
             </w:r>
             <w:r>
               <w:rPr>
@@ -2530,7 +2555,7 @@
                 <w:noProof/>
                 <w:webHidden/>
               </w:rPr>
-              <w:t>6</w:t>
+              <w:t>9</w:t>
             </w:r>
             <w:r>
               <w:rPr>
@@ -2548,10 +2573,11 @@
               <w:tab w:val="right" w:leader="dot" w:pos="9350"/>
             </w:tabs>
             <w:rPr>
+              <w:rFonts w:eastAsiaTheme="minorEastAsia"/>
               <w:noProof/>
             </w:rPr>
           </w:pPr>
-          <w:hyperlink w:anchor="_Toc243235596" w:history="1">
+          <w:hyperlink w:anchor="_Toc243473651" w:history="1">
             <w:r>
               <w:rPr>
                 <w:rStyle w:val="Hyperlink"/>
@@ -2581,7 +2607,7 @@
                 <w:noProof/>
                 <w:webHidden/>
               </w:rPr>
-              <w:instrText xml:space="preserve"> PAGEREF _Toc243235596 \h </w:instrText>
+              <w:instrText xml:space="preserve"> PAGEREF _Toc243473651 \h </w:instrText>
             </w:r>
             <w:r>
               <w:rPr>
@@ -2601,7 +2627,7 @@
                 <w:noProof/>
                 <w:webHidden/>
               </w:rPr>
-              <w:t>7</w:t>
+              <w:t>9</w:t>
             </w:r>
             <w:r>
               <w:rPr>
@@ -2619,10 +2645,11 @@
               <w:tab w:val="right" w:leader="dot" w:pos="9350"/>
             </w:tabs>
             <w:rPr>
+              <w:rFonts w:eastAsiaTheme="minorEastAsia"/>
               <w:noProof/>
             </w:rPr>
           </w:pPr>
-          <w:hyperlink w:anchor="_Toc243235597" w:history="1">
+          <w:hyperlink w:anchor="_Toc243473652" w:history="1">
             <w:r>
               <w:rPr>
                 <w:rStyle w:val="Hyperlink"/>
@@ -2652,7 +2679,7 @@
                 <w:noProof/>
                 <w:webHidden/>
               </w:rPr>
-              <w:instrText xml:space="preserve"> PAGEREF _Toc243235597 \h </w:instrText>
+              <w:instrText xml:space="preserve"> PAGEREF _Toc243473652 \h </w:instrText>
             </w:r>
             <w:r>
               <w:rPr>
@@ -2672,7 +2699,7 @@
                 <w:noProof/>
                 <w:webHidden/>
               </w:rPr>
-              <w:t>7</w:t>
+              <w:t>9</w:t>
             </w:r>
             <w:r>
               <w:rPr>
@@ -2690,10 +2717,11 @@
               <w:tab w:val="right" w:leader="dot" w:pos="9350"/>
             </w:tabs>
             <w:rPr>
+              <w:rFonts w:eastAsiaTheme="minorEastAsia"/>
               <w:noProof/>
             </w:rPr>
           </w:pPr>
-          <w:hyperlink w:anchor="_Toc243235598" w:history="1">
+          <w:hyperlink w:anchor="_Toc243473653" w:history="1">
             <w:r>
               <w:rPr>
                 <w:rStyle w:val="Hyperlink"/>
@@ -2724,7 +2752,7 @@
                 <w:noProof/>
                 <w:webHidden/>
               </w:rPr>
-              <w:instrText xml:space="preserve"> PAGEREF _Toc243235598 \h </w:instrText>
+              <w:instrText xml:space="preserve"> PAGEREF _Toc243473653 \h </w:instrText>
             </w:r>
             <w:r>
               <w:rPr>
@@ -2744,7 +2772,7 @@
                 <w:noProof/>
                 <w:webHidden/>
               </w:rPr>
-              <w:t>7</w:t>
+              <w:t>9</w:t>
             </w:r>
             <w:r>
               <w:rPr>
@@ -2762,10 +2790,11 @@
               <w:tab w:val="right" w:leader="dot" w:pos="9350"/>
             </w:tabs>
             <w:rPr>
+              <w:rFonts w:eastAsiaTheme="minorEastAsia"/>
               <w:noProof/>
             </w:rPr>
           </w:pPr>
-          <w:hyperlink w:anchor="_Toc243235599" w:history="1">
+          <w:hyperlink w:anchor="_Toc243473654" w:history="1">
             <w:r>
               <w:rPr>
                 <w:rStyle w:val="Hyperlink"/>
@@ -2795,7 +2824,7 @@
                 <w:noProof/>
                 <w:webHidden/>
               </w:rPr>
-              <w:instrText xml:space="preserve"> PAGEREF _Toc243235599 \h </w:instrText>
+              <w:instrText xml:space="preserve"> PAGEREF _Toc243473654 \h </w:instrText>
             </w:r>
             <w:r>
               <w:rPr>
@@ -2815,7 +2844,7 @@
                 <w:noProof/>
                 <w:webHidden/>
               </w:rPr>
-              <w:t>8</w:t>
+              <w:t>11</w:t>
             </w:r>
             <w:r>
               <w:rPr>
@@ -2833,10 +2862,11 @@
               <w:tab w:val="right" w:leader="dot" w:pos="9350"/>
             </w:tabs>
             <w:rPr>
+              <w:rFonts w:eastAsiaTheme="minorEastAsia"/>
               <w:noProof/>
             </w:rPr>
           </w:pPr>
-          <w:hyperlink w:anchor="_Toc243235600" w:history="1">
+          <w:hyperlink w:anchor="_Toc243473655" w:history="1">
             <w:r>
               <w:rPr>
                 <w:rStyle w:val="Hyperlink"/>
@@ -2866,7 +2896,7 @@
                 <w:noProof/>
                 <w:webHidden/>
               </w:rPr>
-              <w:instrText xml:space="preserve"> PAGEREF _Toc243235600 \h </w:instrText>
+              <w:instrText xml:space="preserve"> PAGEREF _Toc243473655 \h </w:instrText>
             </w:r>
             <w:r>
               <w:rPr>
@@ -2886,7 +2916,7 @@
                 <w:noProof/>
                 <w:webHidden/>
               </w:rPr>
-              <w:t>9</w:t>
+              <w:t>11</w:t>
             </w:r>
             <w:r>
               <w:rPr>
@@ -2904,10 +2934,11 @@
               <w:tab w:val="right" w:leader="dot" w:pos="9350"/>
             </w:tabs>
             <w:rPr>
+              <w:rFonts w:eastAsiaTheme="minorEastAsia"/>
               <w:noProof/>
             </w:rPr>
           </w:pPr>
-          <w:hyperlink w:anchor="_Toc243235601" w:history="1">
+          <w:hyperlink w:anchor="_Toc243473656" w:history="1">
             <w:r>
               <w:rPr>
                 <w:rStyle w:val="Hyperlink"/>
@@ -2937,7 +2968,7 @@
                 <w:noProof/>
                 <w:webHidden/>
               </w:rPr>
-              <w:instrText xml:space="preserve"> PAGEREF _Toc243235601 \h </w:instrText>
+              <w:instrText xml:space="preserve"> PAGEREF _Toc243473656 \h </w:instrText>
             </w:r>
             <w:r>
               <w:rPr>
@@ -2957,7 +2988,7 @@
                 <w:noProof/>
                 <w:webHidden/>
               </w:rPr>
-              <w:t>9</w:t>
+              <w:t>11</w:t>
             </w:r>
             <w:r>
               <w:rPr>
@@ -2975,10 +3006,11 @@
               <w:tab w:val="right" w:leader="dot" w:pos="9350"/>
             </w:tabs>
             <w:rPr>
+              <w:rFonts w:eastAsiaTheme="minorEastAsia"/>
               <w:noProof/>
             </w:rPr>
           </w:pPr>
-          <w:hyperlink w:anchor="_Toc243235602" w:history="1">
+          <w:hyperlink w:anchor="_Toc243473657" w:history="1">
             <w:r>
               <w:rPr>
                 <w:rStyle w:val="Hyperlink"/>
@@ -3008,7 +3040,7 @@
                 <w:noProof/>
                 <w:webHidden/>
               </w:rPr>
-              <w:instrText xml:space="preserve"> PAGEREF _Toc243235602 \h </w:instrText>
+              <w:instrText xml:space="preserve"> PAGEREF _Toc243473657 \h </w:instrText>
             </w:r>
             <w:r>
               <w:rPr>
@@ -3028,7 +3060,7 @@
                 <w:noProof/>
                 <w:webHidden/>
               </w:rPr>
-              <w:t>9</w:t>
+              <w:t>12</w:t>
             </w:r>
             <w:r>
               <w:rPr>
@@ -3046,10 +3078,11 @@
               <w:tab w:val="right" w:leader="dot" w:pos="9350"/>
             </w:tabs>
             <w:rPr>
+              <w:rFonts w:eastAsiaTheme="minorEastAsia"/>
               <w:noProof/>
             </w:rPr>
           </w:pPr>
-          <w:hyperlink w:anchor="_Toc243235603" w:history="1">
+          <w:hyperlink w:anchor="_Toc243473658" w:history="1">
             <w:r>
               <w:rPr>
                 <w:rStyle w:val="Hyperlink"/>
@@ -3058,7 +3091,7 @@
                 <w:bCs/>
                 <w:noProof/>
               </w:rPr>
-              <w:t>15. REFERENCAT</w:t>
+              <w:t>RAPORTI 2</w:t>
             </w:r>
             <w:r>
               <w:rPr>
@@ -3079,7 +3112,7 @@
                 <w:noProof/>
                 <w:webHidden/>
               </w:rPr>
-              <w:instrText xml:space="preserve"> PAGEREF _Toc243235603 \h </w:instrText>
+              <w:instrText xml:space="preserve"> PAGEREF _Toc243473658 \h </w:instrText>
             </w:r>
             <w:r>
               <w:rPr>
@@ -3099,7 +3132,7 @@
                 <w:noProof/>
                 <w:webHidden/>
               </w:rPr>
-              <w:t>9</w:t>
+              <w:t>12</w:t>
             </w:r>
             <w:r>
               <w:rPr>
@@ -3158,7 +3191,7 @@
           <w:szCs w:val="28"/>
         </w:rPr>
       </w:pPr>
-      <w:bookmarkStart w:id="1" w:name="_Toc243235568"/>
+      <w:bookmarkStart w:id="1" w:name="_Toc243473623"/>
       <w:r>
         <w:rPr>
           <w:rFonts w:ascii="Times New Roman" w:hAnsi="Times New Roman" w:cs="Times New Roman"/>
@@ -3186,7 +3219,7 @@
           <w:szCs w:val="24"/>
         </w:rPr>
       </w:pPr>
-      <w:bookmarkStart w:id="2" w:name="_Toc243235569"/>
+      <w:bookmarkStart w:id="2" w:name="_Toc243473624"/>
       <w:r>
         <w:rPr>
           <w:rFonts w:ascii="Times New Roman" w:hAnsi="Times New Roman" w:cs="Times New Roman"/>
@@ -5759,7 +5792,7 @@
           <w:szCs w:val="24"/>
         </w:rPr>
       </w:pPr>
-      <w:bookmarkStart w:id="3" w:name="_Toc243235570"/>
+      <w:bookmarkStart w:id="3" w:name="_Toc243473625"/>
       <w:r>
         <w:rPr>
           <w:rFonts w:ascii="Times New Roman" w:hAnsi="Times New Roman" w:cs="Times New Roman"/>
@@ -8157,7 +8190,7 @@
           <w:szCs w:val="24"/>
         </w:rPr>
       </w:pPr>
-      <w:bookmarkStart w:id="4" w:name="_Toc243235571"/>
+      <w:bookmarkStart w:id="4" w:name="_Toc243473626"/>
       <w:r>
         <w:rPr>
           <w:rFonts w:ascii="Times New Roman" w:hAnsi="Times New Roman" w:cs="Times New Roman"/>
@@ -9177,7 +9210,7 @@
           <w:lang w:val="pl-PL"/>
         </w:rPr>
       </w:pPr>
-      <w:bookmarkStart w:id="5" w:name="_Toc243235572"/>
+      <w:bookmarkStart w:id="5" w:name="_Toc243473627"/>
       <w:r>
         <w:rPr>
           <w:rFonts w:ascii="Times New Roman" w:hAnsi="Times New Roman" w:cs="Times New Roman"/>
@@ -9224,7 +9257,7 @@
           <w:lang w:val="pl-PL"/>
         </w:rPr>
       </w:pPr>
-      <w:bookmarkStart w:id="6" w:name="_Toc243235573"/>
+      <w:bookmarkStart w:id="6" w:name="_Toc243473628"/>
       <w:r>
         <w:rPr>
           <w:rFonts w:ascii="Times New Roman" w:hAnsi="Times New Roman" w:cs="Times New Roman"/>
@@ -9812,7 +9845,7 @@
           <w:szCs w:val="24"/>
         </w:rPr>
       </w:pPr>
-      <w:bookmarkStart w:id="7" w:name="_Toc243235574"/>
+      <w:bookmarkStart w:id="7" w:name="_Toc243473629"/>
       <w:r>
         <w:rPr>
           <w:rFonts w:ascii="Times New Roman" w:hAnsi="Times New Roman" w:cs="Times New Roman"/>
@@ -10432,7 +10465,7 @@
           <w:lang w:val="pl-PL"/>
         </w:rPr>
       </w:pPr>
-      <w:bookmarkStart w:id="8" w:name="_Toc243235575"/>
+      <w:bookmarkStart w:id="8" w:name="_Toc243473630"/>
       <w:r>
         <w:rPr>
           <w:rFonts w:ascii="Times New Roman" w:hAnsi="Times New Roman" w:cs="Times New Roman"/>
@@ -10473,7 +10506,7 @@
           <w:lang w:val="pl-PL"/>
         </w:rPr>
       </w:pPr>
-      <w:bookmarkStart w:id="9" w:name="_Toc243235576"/>
+      <w:bookmarkStart w:id="9" w:name="_Toc243473631"/>
       <w:r>
         <w:rPr>
           <w:rStyle w:val="Heading2Char"/>
@@ -10521,7 +10554,7 @@
           <w:lang w:val="pl-PL"/>
         </w:rPr>
       </w:pPr>
-      <w:bookmarkStart w:id="10" w:name="_Toc243235577"/>
+      <w:bookmarkStart w:id="10" w:name="_Toc243473632"/>
       <w:r>
         <w:rPr>
           <w:rStyle w:val="Heading2Char"/>
@@ -10568,7 +10601,7 @@
           <w:lang w:val="pl-PL"/>
         </w:rPr>
       </w:pPr>
-      <w:bookmarkStart w:id="11" w:name="_Toc243235578"/>
+      <w:bookmarkStart w:id="11" w:name="_Toc243473633"/>
       <w:r>
         <w:rPr>
           <w:rStyle w:val="Heading2Char"/>
@@ -10607,7 +10640,7 @@
           <w:lang w:val="pl-PL"/>
         </w:rPr>
       </w:pPr>
-      <w:bookmarkStart w:id="12" w:name="_Toc243235579"/>
+      <w:bookmarkStart w:id="12" w:name="_Toc243473634"/>
       <w:r>
         <w:rPr>
           <w:rStyle w:val="Heading2Char"/>
@@ -10646,7 +10679,7 @@
           <w:lang w:val="pl-PL"/>
         </w:rPr>
       </w:pPr>
-      <w:bookmarkStart w:id="13" w:name="_Toc243235580"/>
+      <w:bookmarkStart w:id="13" w:name="_Toc243473635"/>
       <w:r>
         <w:rPr>
           <w:rStyle w:val="Heading2Char"/>
@@ -10687,7 +10720,7 @@
           <w:lang w:val="pl-PL"/>
         </w:rPr>
       </w:pPr>
-      <w:bookmarkStart w:id="14" w:name="_Toc243235581"/>
+      <w:bookmarkStart w:id="14" w:name="_Toc243473636"/>
       <w:r>
         <w:rPr>
           <w:rStyle w:val="Heading2Char"/>
@@ -10726,7 +10759,7 @@
           <w:lang w:val="pl-PL"/>
         </w:rPr>
       </w:pPr>
-      <w:bookmarkStart w:id="15" w:name="_Toc243235582"/>
+      <w:bookmarkStart w:id="15" w:name="_Toc243473637"/>
       <w:r>
         <w:rPr>
           <w:rStyle w:val="Heading2Char"/>
@@ -10771,7 +10804,7 @@
           <w:lang w:val="pl-PL"/>
         </w:rPr>
       </w:pPr>
-      <w:bookmarkStart w:id="16" w:name="_Toc243235583"/>
+      <w:bookmarkStart w:id="16" w:name="_Toc243473638"/>
       <w:r>
         <w:rPr>
           <w:rFonts w:ascii="Times New Roman" w:hAnsi="Times New Roman" w:cs="Times New Roman"/>
@@ -13338,7 +13371,7 @@
           <w:szCs w:val="24"/>
         </w:rPr>
       </w:pPr>
-      <w:bookmarkStart w:id="17" w:name="_Toc243235584"/>
+      <w:bookmarkStart w:id="17" w:name="_Toc243473639"/>
       <w:r>
         <w:rPr>
           <w:rFonts w:ascii="Times New Roman" w:hAnsi="Times New Roman" w:cs="Times New Roman"/>
@@ -16264,7 +16297,7 @@
           <w:szCs w:val="24"/>
         </w:rPr>
       </w:pPr>
-      <w:bookmarkStart w:id="18" w:name="_Toc243235585"/>
+      <w:bookmarkStart w:id="18" w:name="_Toc243473640"/>
       <w:r>
         <w:rPr>
           <w:rFonts w:ascii="Times New Roman" w:hAnsi="Times New Roman" w:cs="Times New Roman"/>
@@ -16426,7 +16459,7 @@
           <w:szCs w:val="24"/>
         </w:rPr>
       </w:pPr>
-      <w:bookmarkStart w:id="19" w:name="_Toc243235586"/>
+      <w:bookmarkStart w:id="19" w:name="_Toc243473641"/>
       <w:r>
         <w:rPr>
           <w:rFonts w:ascii="Times New Roman" w:hAnsi="Times New Roman" w:cs="Times New Roman"/>
@@ -16901,7 +16934,7 @@
           <w:szCs w:val="24"/>
         </w:rPr>
       </w:pPr>
-      <w:bookmarkStart w:id="20" w:name="_Toc243235587"/>
+      <w:bookmarkStart w:id="20" w:name="_Toc243473642"/>
       <w:r>
         <w:rPr>
           <w:rFonts w:ascii="Times New Roman" w:hAnsi="Times New Roman" w:cs="Times New Roman"/>
@@ -17412,7 +17445,7 @@
           <w:szCs w:val="24"/>
         </w:rPr>
       </w:pPr>
-      <w:bookmarkStart w:id="21" w:name="_Toc243235588"/>
+      <w:bookmarkStart w:id="21" w:name="_Toc243473643"/>
       <w:r>
         <w:rPr>
           <w:rFonts w:ascii="Times New Roman" w:hAnsi="Times New Roman" w:cs="Times New Roman"/>
@@ -17911,7 +17944,7 @@
           <w:szCs w:val="24"/>
         </w:rPr>
       </w:pPr>
-      <w:bookmarkStart w:id="22" w:name="_Toc243235589"/>
+      <w:bookmarkStart w:id="22" w:name="_Toc243473644"/>
       <w:r>
         <w:rPr>
           <w:rFonts w:ascii="Times New Roman" w:hAnsi="Times New Roman" w:cs="Times New Roman"/>
@@ -18386,7 +18419,7 @@
           <w:szCs w:val="24"/>
         </w:rPr>
       </w:pPr>
-      <w:bookmarkStart w:id="23" w:name="_Toc243235590"/>
+      <w:bookmarkStart w:id="23" w:name="_Toc243473645"/>
       <w:r>
         <w:rPr>
           <w:rFonts w:ascii="Times New Roman" w:hAnsi="Times New Roman" w:cs="Times New Roman"/>
@@ -19127,7 +19160,7 @@
           <w:lang w:val="pl-PL"/>
         </w:rPr>
       </w:pPr>
-      <w:bookmarkStart w:id="24" w:name="_Toc243235591"/>
+      <w:bookmarkStart w:id="24" w:name="_Toc243473646"/>
       <w:r>
         <w:rPr>
           <w:rFonts w:ascii="Times New Roman" w:hAnsi="Times New Roman" w:cs="Times New Roman"/>
@@ -19173,7 +19206,7 @@
           <w:szCs w:val="24"/>
         </w:rPr>
       </w:pPr>
-      <w:bookmarkStart w:id="25" w:name="_Toc243235592"/>
+      <w:bookmarkStart w:id="25" w:name="_Toc243473647"/>
       <w:r>
         <w:rPr>
           <w:rFonts w:ascii="Times New Roman" w:hAnsi="Times New Roman" w:cs="Times New Roman"/>
@@ -19666,7 +19699,7 @@
           <w:szCs w:val="24"/>
         </w:rPr>
       </w:pPr>
-      <w:bookmarkStart w:id="26" w:name="_Toc243235593"/>
+      <w:bookmarkStart w:id="26" w:name="_Toc243473648"/>
       <w:r>
         <w:rPr>
           <w:rFonts w:ascii="Times New Roman" w:hAnsi="Times New Roman" w:cs="Times New Roman"/>
@@ -20100,7 +20133,25 @@
           <w:sz w:val="24"/>
           <w:szCs w:val="24"/>
         </w:rPr>
-        <w:t xml:space="preserve"> backend-it do </w:t>
+        <w:t xml:space="preserve"> backend-it </w:t>
+      </w:r>
+      <w:proofErr w:type="gramStart"/>
+      <w:r>
+        <w:rPr>
+          <w:rFonts w:ascii="Times New Roman" w:hAnsi="Times New Roman" w:cs="Times New Roman"/>
+          <w:sz w:val="24"/>
+          <w:szCs w:val="24"/>
+        </w:rPr>
+        <w:t>do</w:t>
+      </w:r>
+      <w:proofErr w:type="gramEnd"/>
+      <w:r>
+        <w:rPr>
+          <w:rFonts w:ascii="Times New Roman" w:hAnsi="Times New Roman" w:cs="Times New Roman"/>
+          <w:sz w:val="24"/>
+          <w:szCs w:val="24"/>
+        </w:rPr>
+        <w:t xml:space="preserve"> </w:t>
       </w:r>
       <w:proofErr w:type="spellStart"/>
       <w:r>
@@ -20278,7 +20329,7 @@
           <w:lang w:val="pl-PL"/>
         </w:rPr>
       </w:pPr>
-      <w:bookmarkStart w:id="27" w:name="_Toc243235594"/>
+      <w:bookmarkStart w:id="27" w:name="_Toc243473649"/>
       <w:r>
         <w:rPr>
           <w:rFonts w:ascii="Times New Roman" w:hAnsi="Times New Roman" w:cs="Times New Roman"/>
@@ -20329,7 +20380,7 @@
           <w:szCs w:val="24"/>
         </w:rPr>
       </w:pPr>
-      <w:bookmarkStart w:id="28" w:name="_Toc243235595"/>
+      <w:bookmarkStart w:id="28" w:name="_Toc243473650"/>
       <w:r>
         <w:rPr>
           <w:rFonts w:ascii="Times New Roman" w:hAnsi="Times New Roman" w:cs="Times New Roman"/>
@@ -21431,7 +21482,7 @@
           <w:szCs w:val="24"/>
         </w:rPr>
       </w:pPr>
-      <w:bookmarkStart w:id="29" w:name="_Toc243235596"/>
+      <w:bookmarkStart w:id="29" w:name="_Toc243473651"/>
       <w:r>
         <w:rPr>
           <w:rFonts w:ascii="Times New Roman" w:hAnsi="Times New Roman" w:cs="Times New Roman"/>
@@ -21808,7 +21859,7 @@
           <w:szCs w:val="24"/>
         </w:rPr>
       </w:pPr>
-      <w:bookmarkStart w:id="30" w:name="_Toc243235597"/>
+      <w:bookmarkStart w:id="30" w:name="_Toc243473652"/>
       <w:r>
         <w:rPr>
           <w:rFonts w:ascii="Times New Roman" w:hAnsi="Times New Roman" w:cs="Times New Roman"/>
@@ -22553,7 +22604,7 @@
           <w:lang w:val="pl-PL"/>
         </w:rPr>
       </w:pPr>
-      <w:bookmarkStart w:id="31" w:name="_Toc243235598"/>
+      <w:bookmarkStart w:id="31" w:name="_Toc243473653"/>
       <w:r>
         <w:rPr>
           <w:rFonts w:ascii="Times New Roman" w:hAnsi="Times New Roman" w:cs="Times New Roman"/>
@@ -25657,7 +25708,7 @@
           <w:szCs w:val="24"/>
         </w:rPr>
       </w:pPr>
-      <w:bookmarkStart w:id="32" w:name="_Toc243235599"/>
+      <w:bookmarkStart w:id="32" w:name="_Toc243473654"/>
       <w:r>
         <w:rPr>
           <w:rFonts w:ascii="Times New Roman" w:hAnsi="Times New Roman" w:cs="Times New Roman"/>
@@ -27031,7 +27082,7 @@
           <w:szCs w:val="24"/>
         </w:rPr>
       </w:pPr>
-      <w:bookmarkStart w:id="33" w:name="_Toc243235600"/>
+      <w:bookmarkStart w:id="33" w:name="_Toc243473655"/>
       <w:r>
         <w:rPr>
           <w:rFonts w:ascii="Times New Roman" w:hAnsi="Times New Roman" w:cs="Times New Roman"/>
@@ -27799,7 +27850,7 @@
           <w:szCs w:val="24"/>
         </w:rPr>
       </w:pPr>
-      <w:bookmarkStart w:id="34" w:name="_Toc243235601"/>
+      <w:bookmarkStart w:id="34" w:name="_Toc243473656"/>
       <w:r>
         <w:rPr>
           <w:rFonts w:ascii="Times New Roman" w:hAnsi="Times New Roman" w:cs="Times New Roman"/>
@@ -28861,7 +28912,7 @@
           <w:szCs w:val="24"/>
         </w:rPr>
       </w:pPr>
-      <w:bookmarkStart w:id="35" w:name="_Toc243235602"/>
+      <w:bookmarkStart w:id="35" w:name="_Toc243473657"/>
       <w:r>
         <w:rPr>
           <w:rFonts w:ascii="Times New Roman" w:hAnsi="Times New Roman" w:cs="Times New Roman"/>
@@ -29162,6 +29213,7 @@
           <w:szCs w:val="28"/>
         </w:rPr>
       </w:pPr>
+      <w:bookmarkStart w:id="36" w:name="_Toc243473658"/>
       <w:r>
         <w:rPr>
           <w:rFonts w:ascii="Times New Roman" w:hAnsi="Times New Roman" w:cs="Times New Roman"/>
@@ -29173,6 +29225,7 @@
         </w:rPr>
         <w:t>RAPORTI 2</w:t>
       </w:r>
+      <w:bookmarkEnd w:id="36"/>
     </w:p>
     <w:p>
       <w:pPr>

</xml_diff>